<commit_message>
docs: link platform proposal to attribution plan and guidelines
Co-authored-by: Ashleymmy <Ashleymmy@users.noreply.github.com>
</commit_message>
<xml_diff>
--- a/改造/平台体验与财务链路改造方案_待审核_2026-10-08.docx
+++ b/改造/平台体验与财务链路改造方案_待审核_2026-10-08.docx
@@ -4569,6 +4569,11 @@
       </w:r>
     </w:p>
     <w:p>
+      <w:r>
+        <w:t>上传与识别的完整设计（分析过程面板、多维表格结果、待处理动作、引擎缺陷修复）见《报表上传与归因体验优化方案_待审核_2026-10-08》。</w:t>
+      </w:r>
+    </w:p>
+    <w:p>
       <w:pPr>
         <w:pStyle w:val="Heading2"/>
       </w:pPr>
@@ -9753,6 +9758,31 @@
       </w:tr>
     </w:tbl>
     <w:p/>
+    <w:p>
+      <w:r>
+        <w:t xml:space="preserve">报表上传与归因方案的实施内容并入阶段 0、2、3，见该方案第 6 节。开发过程遵守 </w:t>
+      </w:r>
+      <w:r>
+        <w:rPr>
+          <w:rFonts w:ascii="Consolas" w:hAnsi="Consolas"/>
+          <w:sz w:val="19"/>
+        </w:rPr>
+        <w:t>docs/规范/OPC体验与开发规范.md</w:t>
+      </w:r>
+      <w:r>
+        <w:t xml:space="preserve"> 和根目录 </w:t>
+      </w:r>
+      <w:r>
+        <w:rPr>
+          <w:rFonts w:ascii="Consolas" w:hAnsi="Consolas"/>
+          <w:sz w:val="19"/>
+        </w:rPr>
+        <w:t>AGENTS.md</w:t>
+      </w:r>
+      <w:r>
+        <w:t>。</w:t>
+      </w:r>
+    </w:p>
     <w:p>
       <w:r>
         <w:t>阶段 0 风险低、见效快，可以在决策讨论期间先做。阶段 2 的数据迁移按财务方案第 8 节执行（新规则生效日 T、只读保留旧账、回退开关），并吸收 6.2 节 F3、F4 的约束。</w:t>

</xml_diff>